<commit_message>
fix(table): resolve horizontal overflow in Node.js Libuv Event Loop table with tabularx card styling across LaTeX, Typst, and Word
</commit_message>
<xml_diff>
--- a/internship_report.docx
+++ b/internship_report.docx
@@ -698,6 +698,304 @@
     <w:p>
       <w:r>
         <w:t>Node.js combines Google's V8 C++ JavaScript engine with the Libuv asynchronous I/O library, employing an event-driven, single-threaded execution model that offloads blocking I/O to operating system threads. This architecture enables high-concurrency network servers with minimal memory footprint.</w:t>
+      </w:r>
+    </w:p>
+    <w:p>
+      <w:r>
+        <w:t>The Node.js Libuv Event Loop operates as a continuous state machine processing callbacks across distinct sequential phases (Table 3.1):</w:t>
+      </w:r>
+    </w:p>
+    <w:tbl>
+      <w:tblPr>
+        <w:tblW w:type="auto" w:w="0"/>
+        <w:jc w:val="center"/>
+        <w:tblLook w:firstColumn="1" w:firstRow="1" w:lastColumn="0" w:lastRow="0" w:noHBand="0" w:noVBand="1" w:val="04A0"/>
+      </w:tblPr>
+      <w:tblGrid>
+        <w:gridCol w:w="4500"/>
+        <w:gridCol w:w="4500"/>
+      </w:tblGrid>
+      <w:tr>
+        <w:tc>
+          <w:tcPr>
+            <w:tcW w:type="dxa" w:w="2592"/>
+            <w:tcMar>
+              <w:top w:w="80" w:type="dxa"/>
+              <w:bottom w:w="80" w:type="dxa"/>
+              <w:left w:w="100" w:type="dxa"/>
+              <w:right w:w="100" w:type="dxa"/>
+            </w:tcMar>
+          </w:tcPr>
+          <w:p>
+            <w:r>
+              <w:rPr>
+                <w:b/>
+                <w:color w:val="0C2C56"/>
+              </w:rPr>
+              <w:t>Phase</w:t>
+            </w:r>
+          </w:p>
+        </w:tc>
+        <w:tc>
+          <w:tcPr>
+            <w:tcW w:type="dxa" w:w="6480"/>
+            <w:tcMar>
+              <w:top w:w="80" w:type="dxa"/>
+              <w:bottom w:w="80" w:type="dxa"/>
+              <w:left w:w="100" w:type="dxa"/>
+              <w:right w:w="100" w:type="dxa"/>
+            </w:tcMar>
+          </w:tcPr>
+          <w:p>
+            <w:r>
+              <w:rPr>
+                <w:b/>
+                <w:color w:val="0C2C56"/>
+              </w:rPr>
+              <w:t>Operational Function and Responsibilities</w:t>
+            </w:r>
+          </w:p>
+        </w:tc>
+      </w:tr>
+      <w:tr>
+        <w:tc>
+          <w:tcPr>
+            <w:tcW w:type="dxa" w:w="2592"/>
+            <w:tcMar>
+              <w:top w:w="80" w:type="dxa"/>
+              <w:bottom w:w="80" w:type="dxa"/>
+              <w:left w:w="100" w:type="dxa"/>
+              <w:right w:w="100" w:type="dxa"/>
+            </w:tcMar>
+          </w:tcPr>
+          <w:p>
+            <w:r>
+              <w:rPr>
+                <w:b/>
+                <w:color w:val="184C78"/>
+              </w:rPr>
+              <w:t>Timers</w:t>
+            </w:r>
+          </w:p>
+        </w:tc>
+        <w:tc>
+          <w:tcPr>
+            <w:tcW w:type="dxa" w:w="6480"/>
+            <w:tcMar>
+              <w:top w:w="80" w:type="dxa"/>
+              <w:bottom w:w="80" w:type="dxa"/>
+              <w:left w:w="100" w:type="dxa"/>
+              <w:right w:w="100" w:type="dxa"/>
+            </w:tcMar>
+          </w:tcPr>
+          <w:p>
+            <w:r>
+              <w:t>Executes callbacks scheduled by setTimeout() and setInterval().</w:t>
+            </w:r>
+          </w:p>
+        </w:tc>
+      </w:tr>
+      <w:tr>
+        <w:tc>
+          <w:tcPr>
+            <w:tcW w:type="dxa" w:w="2592"/>
+            <w:tcMar>
+              <w:top w:w="80" w:type="dxa"/>
+              <w:bottom w:w="80" w:type="dxa"/>
+              <w:left w:w="100" w:type="dxa"/>
+              <w:right w:w="100" w:type="dxa"/>
+            </w:tcMar>
+          </w:tcPr>
+          <w:p>
+            <w:r>
+              <w:rPr>
+                <w:b/>
+                <w:color w:val="184C78"/>
+              </w:rPr>
+              <w:t>Pending I/O</w:t>
+            </w:r>
+          </w:p>
+        </w:tc>
+        <w:tc>
+          <w:tcPr>
+            <w:tcW w:type="dxa" w:w="6480"/>
+            <w:tcMar>
+              <w:top w:w="80" w:type="dxa"/>
+              <w:bottom w:w="80" w:type="dxa"/>
+              <w:left w:w="100" w:type="dxa"/>
+              <w:right w:w="100" w:type="dxa"/>
+            </w:tcMar>
+          </w:tcPr>
+          <w:p>
+            <w:r>
+              <w:t>Executes I/O callbacks deferred from the previous loop iteration.</w:t>
+            </w:r>
+          </w:p>
+        </w:tc>
+      </w:tr>
+      <w:tr>
+        <w:tc>
+          <w:tcPr>
+            <w:tcW w:type="dxa" w:w="2592"/>
+            <w:tcMar>
+              <w:top w:w="80" w:type="dxa"/>
+              <w:bottom w:w="80" w:type="dxa"/>
+              <w:left w:w="100" w:type="dxa"/>
+              <w:right w:w="100" w:type="dxa"/>
+            </w:tcMar>
+          </w:tcPr>
+          <w:p>
+            <w:r>
+              <w:rPr>
+                <w:b/>
+                <w:color w:val="184C78"/>
+              </w:rPr>
+              <w:t>Idle, Prepare</w:t>
+            </w:r>
+          </w:p>
+        </w:tc>
+        <w:tc>
+          <w:tcPr>
+            <w:tcW w:type="dxa" w:w="6480"/>
+            <w:tcMar>
+              <w:top w:w="80" w:type="dxa"/>
+              <w:bottom w:w="80" w:type="dxa"/>
+              <w:left w:w="100" w:type="dxa"/>
+              <w:right w:w="100" w:type="dxa"/>
+            </w:tcMar>
+          </w:tcPr>
+          <w:p>
+            <w:r>
+              <w:t>Internal runtime routines utilized exclusively by the Libuv subsystem.</w:t>
+            </w:r>
+          </w:p>
+        </w:tc>
+      </w:tr>
+      <w:tr>
+        <w:tc>
+          <w:tcPr>
+            <w:tcW w:type="dxa" w:w="2592"/>
+            <w:tcMar>
+              <w:top w:w="80" w:type="dxa"/>
+              <w:bottom w:w="80" w:type="dxa"/>
+              <w:left w:w="100" w:type="dxa"/>
+              <w:right w:w="100" w:type="dxa"/>
+            </w:tcMar>
+          </w:tcPr>
+          <w:p>
+            <w:r>
+              <w:rPr>
+                <w:b/>
+                <w:color w:val="184C78"/>
+              </w:rPr>
+              <w:t>Poll</w:t>
+            </w:r>
+          </w:p>
+        </w:tc>
+        <w:tc>
+          <w:tcPr>
+            <w:tcW w:type="dxa" w:w="6480"/>
+            <w:tcMar>
+              <w:top w:w="80" w:type="dxa"/>
+              <w:bottom w:w="80" w:type="dxa"/>
+              <w:left w:w="100" w:type="dxa"/>
+              <w:right w:w="100" w:type="dxa"/>
+            </w:tcMar>
+          </w:tcPr>
+          <w:p>
+            <w:r>
+              <w:t>Retrieves new I/O events, executes I/O-related callbacks, and blocks if empty.</w:t>
+            </w:r>
+          </w:p>
+        </w:tc>
+      </w:tr>
+      <w:tr>
+        <w:tc>
+          <w:tcPr>
+            <w:tcW w:type="dxa" w:w="2592"/>
+            <w:tcMar>
+              <w:top w:w="80" w:type="dxa"/>
+              <w:bottom w:w="80" w:type="dxa"/>
+              <w:left w:w="100" w:type="dxa"/>
+              <w:right w:w="100" w:type="dxa"/>
+            </w:tcMar>
+          </w:tcPr>
+          <w:p>
+            <w:r>
+              <w:rPr>
+                <w:b/>
+                <w:color w:val="184C78"/>
+              </w:rPr>
+              <w:t>Check</w:t>
+            </w:r>
+          </w:p>
+        </w:tc>
+        <w:tc>
+          <w:tcPr>
+            <w:tcW w:type="dxa" w:w="6480"/>
+            <w:tcMar>
+              <w:top w:w="80" w:type="dxa"/>
+              <w:bottom w:w="80" w:type="dxa"/>
+              <w:left w:w="100" w:type="dxa"/>
+              <w:right w:w="100" w:type="dxa"/>
+            </w:tcMar>
+          </w:tcPr>
+          <w:p>
+            <w:r>
+              <w:t>Executes callbacks invoked via setImmediate().</w:t>
+            </w:r>
+          </w:p>
+        </w:tc>
+      </w:tr>
+      <w:tr>
+        <w:tc>
+          <w:tcPr>
+            <w:tcW w:type="dxa" w:w="2592"/>
+            <w:tcMar>
+              <w:top w:w="80" w:type="dxa"/>
+              <w:bottom w:w="80" w:type="dxa"/>
+              <w:left w:w="100" w:type="dxa"/>
+              <w:right w:w="100" w:type="dxa"/>
+            </w:tcMar>
+          </w:tcPr>
+          <w:p>
+            <w:r>
+              <w:rPr>
+                <w:b/>
+                <w:color w:val="184C78"/>
+              </w:rPr>
+              <w:t>Close Callbacks</w:t>
+            </w:r>
+          </w:p>
+        </w:tc>
+        <w:tc>
+          <w:tcPr>
+            <w:tcW w:type="dxa" w:w="6480"/>
+            <w:tcMar>
+              <w:top w:w="80" w:type="dxa"/>
+              <w:bottom w:w="80" w:type="dxa"/>
+              <w:left w:w="100" w:type="dxa"/>
+              <w:right w:w="100" w:type="dxa"/>
+            </w:tcMar>
+          </w:tcPr>
+          <w:p>
+            <w:r>
+              <w:t>Handles abrupt connection closures (e.g., socket.on('close')).</w:t>
+            </w:r>
+          </w:p>
+        </w:tc>
+      </w:tr>
+    </w:tbl>
+    <w:p>
+      <w:pPr>
+        <w:jc w:val="center"/>
+      </w:pPr>
+      <w:r>
+        <w:rPr>
+          <w:i/>
+          <w:sz w:val="20"/>
+        </w:rPr>
+        <w:t>Table 3.1: Phases of the Node.js Libuv Event Loop Execution Model.</w:t>
       </w:r>
     </w:p>
     <w:p>

</xml_diff>

<commit_message>
Update student credentials to Shahriar Hasan, Student ID: 2002138 across all document formats
</commit_message>
<xml_diff>
--- a/internship_report.docx
+++ b/internship_report.docx
@@ -52,9 +52,9 @@
         <w:br/>
       </w:r>
       <w:r>
-        <w:t>Hasan Shahriar</w:t>
+        <w:t>Shahriar Hasan</w:t>
         <w:br/>
-        <w:t>Student ID: 2002126</w:t>
+        <w:t>Student ID: 2002138</w:t>
         <w:br/>
         <w:t>Level: 4, Semester: II</w:t>
         <w:br/>
@@ -206,9 +206,9 @@
         <w:br/>
         <w:t>....................................................</w:t>
         <w:br/>
-        <w:t>Hasan Shahriar</w:t>
+        <w:t>Shahriar Hasan</w:t>
         <w:br/>
-        <w:t>Student ID: 2002126</w:t>
+        <w:t>Student ID: 2002138</w:t>
         <w:br/>
         <w:t>Department of ECE, HSTU</w:t>
         <w:br/>
@@ -234,7 +234,7 @@
     </w:p>
     <w:p>
       <w:r>
-        <w:t>This is to certify that the internship report titled “Backend Web Development Using JavaScript Frameworks at Digicon Technologies PLC” is an authentic record of industrial attachment work performed by Hasan Shahriar (Student ID: 2002126), a candidate for the degree of Bachelor of Science in Electronics and Communication Engineering from Hajee Mohammad Danesh Science and Technology University (HSTU), Dinajpur, Bangladesh.</w:t>
+        <w:t>This is to certify that the internship report titled “Backend Web Development Using JavaScript Frameworks at Digicon Technologies PLC” is an authentic record of industrial attachment work performed by Shahriar Hasan (Student ID: 2002138), a candidate for the degree of Bachelor of Science in Electronics and Communication Engineering from Hajee Mohammad Danesh Science and Technology University (HSTU), Dinajpur, Bangladesh.</w:t>
         <w:br/>
         <w:br/>
         <w:t>The internship was carried out in partial fulfillment of the requirements for the course ECE 450: Industrial Training / Internship under my academic supervision. To the best of my knowledge, this report has not been submitted previously to any other university or institution.</w:t>
@@ -377,7 +377,7 @@
     </w:p>
     <w:p>
       <w:r>
-        <w:t>This is to certify that Hasan Shahriar, Student ID: 2002126, a student of Bachelor of Science in Electronics and Communication Engineering at Hajee Mohammad Danesh Science and Technology University (HSTU), Dinajpur, has successfully completed his industrial internship with Digicon Technologies PLC from July 01, 2026 to September 30, 2026.</w:t>
+        <w:t>This is to certify that Shahriar Hasan, Student ID: 2002138, a student of Bachelor of Science in Electronics and Communication Engineering at Hajee Mohammad Danesh Science and Technology University (HSTU), Dinajpur, has successfully completed his industrial internship with Digicon Technologies PLC from July 01, 2026 to September 30, 2026.</w:t>
         <w:br/>
         <w:br/>
         <w:t>During his tenure as a Software Engineering Intern (Backend Development) within our Software Engineering and Technology Solutions Division, he contributed to high-throughput RESTful API engineering using Node.js, Express.js, and NestJS, CRM ticket routing, SMS Gateway microservices with BullMQ, and Docker containerization.</w:t>
@@ -471,9 +471,9 @@
         <w:br/>
         <w:t>....................................................</w:t>
         <w:br/>
-        <w:t>Hasan Shahriar</w:t>
+        <w:t>Shahriar Hasan</w:t>
         <w:br/>
-        <w:t>Student ID: 2002126</w:t>
+        <w:t>Student ID: 2002138</w:t>
         <w:br/>
         <w:t>Department of ECE, HSTU</w:t>
         <w:br/>

</xml_diff>

<commit_message>
Embed official Digicon internship certificate image on certificate page across all formats
</commit_message>
<xml_diff>
--- a/internship_report.docx
+++ b/internship_report.docx
@@ -311,12 +311,13 @@
     </w:p>
     <w:p>
       <w:pPr>
+        <w:spacing w:before="200"/>
         <w:jc w:val="center"/>
       </w:pPr>
       <w:r>
         <w:drawing>
           <wp:inline xmlns:a="http://schemas.openxmlformats.org/drawingml/2006/main" xmlns:pic="http://schemas.openxmlformats.org/drawingml/2006/picture">
-            <wp:extent cx="1645920" cy="794156"/>
+            <wp:extent cx="5669280" cy="7628972"/>
             <wp:docPr id="2" name="Picture 2"/>
             <wp:cNvGraphicFramePr>
               <a:graphicFrameLocks noChangeAspect="1"/>
@@ -325,7 +326,7 @@
               <a:graphicData uri="http://schemas.openxmlformats.org/drawingml/2006/picture">
                 <pic:pic>
                   <pic:nvPicPr>
-                    <pic:cNvPr id="0" name="digicon_logo.png"/>
+                    <pic:cNvPr id="0" name="cert.png"/>
                     <pic:cNvPicPr/>
                   </pic:nvPicPr>
                   <pic:blipFill>
@@ -337,7 +338,7 @@
                   <pic:spPr>
                     <a:xfrm>
                       <a:off x="0" y="0"/>
-                      <a:ext cx="1645920" cy="794156"/>
+                      <a:ext cx="5669280" cy="7628972"/>
                     </a:xfrm>
                     <a:prstGeom prst="rect"/>
                   </pic:spPr>
@@ -348,99 +349,6 @@
         </w:drawing>
       </w:r>
     </w:p>
-    <w:p>
-      <w:pPr>
-        <w:jc w:val="center"/>
-      </w:pPr>
-      <w:r>
-        <w:rPr>
-          <w:b/>
-        </w:rPr>
-        <w:t>DIGICON TECHNOLOGIES PLC</w:t>
-        <w:br/>
-      </w:r>
-      <w:r>
-        <w:t>Rajuk Trade Center, Nikunja-2, Khilkhet, Dhaka-1229, Bangladesh</w:t>
-        <w:br/>
-        <w:t>https://www.digicontechnologies.com | info@digicontechnologies.com</w:t>
-        <w:br/>
-        <w:br/>
-      </w:r>
-      <w:r>
-        <w:rPr>
-          <w:b/>
-        </w:rPr>
-        <w:t>TO WHOM IT MAY CONCERN</w:t>
-        <w:br/>
-        <w:br/>
-      </w:r>
-    </w:p>
-    <w:p>
-      <w:r>
-        <w:t>This is to certify that Shahriar Hasan, Student ID: 2002138, a student of Bachelor of Science in Electronics and Communication Engineering at Hajee Mohammad Danesh Science and Technology University (HSTU), Dinajpur, has successfully completed his industrial internship with Digicon Technologies PLC from July 01, 2026 to September 30, 2026.</w:t>
-        <w:br/>
-        <w:br/>
-        <w:t>During his tenure as a Software Engineering Intern (Backend Development) within our Software Engineering and Technology Solutions Division, he contributed to high-throughput RESTful API engineering using Node.js, Express.js, and NestJS, CRM ticket routing, SMS Gateway microservices with BullMQ, and Docker containerization.</w:t>
-        <w:br/>
-        <w:br/>
-        <w:t>His conduct and performance were outstanding. We wish him all the very best in his prospective endeavors.</w:t>
-        <w:br/>
-        <w:br/>
-        <w:br/>
-      </w:r>
-    </w:p>
-    <w:tbl>
-      <w:tblPr>
-        <w:tblW w:type="auto" w:w="0"/>
-        <w:tblLook w:firstColumn="1" w:firstRow="1" w:lastColumn="0" w:lastRow="0" w:noHBand="0" w:noVBand="1" w:val="04A0"/>
-        <w:tblBorders>
-          <w:top w:val="none"/>
-          <w:left w:val="none"/>
-          <w:bottom w:val="none"/>
-          <w:right w:val="none"/>
-          <w:insideH w:val="none"/>
-          <w:insideV w:val="none"/>
-        </w:tblBorders>
-      </w:tblPr>
-      <w:tblGrid>
-        <w:gridCol w:w="4500"/>
-        <w:gridCol w:w="4500"/>
-      </w:tblGrid>
-      <w:tr>
-        <w:tc>
-          <w:tcPr>
-            <w:tcW w:type="dxa" w:w="4500"/>
-          </w:tcPr>
-          <w:p>
-            <w:r>
-              <w:t>....................................................</w:t>
-              <w:br/>
-              <w:t>Industrial Supervisor</w:t>
-              <w:br/>
-              <w:t>Lead Software Architect</w:t>
-              <w:br/>
-              <w:t>Digicon Technologies PLC</w:t>
-            </w:r>
-          </w:p>
-        </w:tc>
-        <w:tc>
-          <w:tcPr>
-            <w:tcW w:type="dxa" w:w="4500"/>
-          </w:tcPr>
-          <w:p>
-            <w:r>
-              <w:t>....................................................</w:t>
-              <w:br/>
-              <w:t>Head of Human Resources</w:t>
-              <w:br/>
-              <w:t>Digicon Technologies PLC</w:t>
-              <w:br/>
-              <w:t>Dhaka, Bangladesh</w:t>
-            </w:r>
-          </w:p>
-        </w:tc>
-      </w:tr>
-    </w:tbl>
     <w:p>
       <w:r>
         <w:br w:type="page"/>

</xml_diff>

<commit_message>
Remove Letter of Transmittal, Academic Certificate, Declaration, and Dedication from all documents
</commit_message>
<xml_diff>
--- a/internship_report.docx
+++ b/internship_report.docx
@@ -164,148 +164,6 @@
           <w:color w:val="0C2C56"/>
           <w:sz w:val="32"/>
         </w:rPr>
-        <w:t>Letter of Transmittal</w:t>
-      </w:r>
-    </w:p>
-    <w:p>
-      <w:r>
-        <w:t>Date: October 04, 2026</w:t>
-        <w:br/>
-        <w:t>To:</w:t>
-        <w:br/>
-        <w:t>The Chairman</w:t>
-        <w:br/>
-        <w:t>Department of Electronics and Communication Engineering</w:t>
-        <w:br/>
-        <w:t>Hajee Mohammad Danesh Science and Technology University (HSTU)</w:t>
-        <w:br/>
-        <w:t>Dinajpur-5200, Bangladesh.</w:t>
-        <w:br/>
-        <w:br/>
-      </w:r>
-      <w:r>
-        <w:rPr>
-          <w:b/>
-        </w:rPr>
-        <w:t>Subject: Submission of Internship Report on Backend Web Development at Digicon Technologies PLC.</w:t>
-        <w:br/>
-        <w:br/>
-      </w:r>
-      <w:r>
-        <w:t>Dear Sir,</w:t>
-        <w:br/>
-        <w:br/>
-        <w:t>It is an immense privilege to submit my industrial attachment report titled “Backend Web Development Using JavaScript Frameworks at Digicon Technologies PLC”, completed as an indispensable requirement for the degree of Bachelor of Science in Electronics and Communication Engineering (Course Code: ECE 450).</w:t>
-        <w:br/>
-        <w:br/>
-        <w:t>This internship provided me with invaluable practical exposure to enterprise-level software engineering paradigms in an industry-leading IT and BPO enterprise. Throughout the tenure of my internship at Digicon Technologies PLC, I was actively embedded within the Backend Engineering division. I was entrusted with architecting, developing, and optimizing mission-critical backend services utilizing the JavaScript and TypeScript runtime ecosystems, specifically leveraging Node.js, Express.js, and NestJS alongside PostgreSQL, MongoDB, and Redis.</w:t>
-        <w:br/>
-        <w:br/>
-        <w:t>Sincerely yours,</w:t>
-        <w:br/>
-        <w:br/>
-        <w:t>....................................................</w:t>
-        <w:br/>
-        <w:t>Shahriar Hasan</w:t>
-        <w:br/>
-        <w:t>Student ID: 2002138</w:t>
-        <w:br/>
-        <w:t>Department of ECE, HSTU</w:t>
-        <w:br/>
-      </w:r>
-    </w:p>
-    <w:p>
-      <w:r>
-        <w:br w:type="page"/>
-      </w:r>
-    </w:p>
-    <w:p>
-      <w:pPr>
-        <w:spacing w:before="360" w:after="240"/>
-      </w:pPr>
-      <w:r>
-        <w:rPr>
-          <w:b/>
-          <w:color w:val="0C2C56"/>
-          <w:sz w:val="32"/>
-        </w:rPr>
-        <w:t>Academic Supervisor's Certificate</w:t>
-      </w:r>
-    </w:p>
-    <w:p>
-      <w:r>
-        <w:t>This is to certify that the internship report titled “Backend Web Development Using JavaScript Frameworks at Digicon Technologies PLC” is an authentic record of industrial attachment work performed by Shahriar Hasan (Student ID: 2002138), a candidate for the degree of Bachelor of Science in Electronics and Communication Engineering from Hajee Mohammad Danesh Science and Technology University (HSTU), Dinajpur, Bangladesh.</w:t>
-        <w:br/>
-        <w:br/>
-        <w:t>The internship was carried out in partial fulfillment of the requirements for the course ECE 450: Industrial Training / Internship under my academic supervision. To the best of my knowledge, this report has not been submitted previously to any other university or institution.</w:t>
-        <w:br/>
-        <w:br/>
-        <w:br/>
-      </w:r>
-    </w:p>
-    <w:tbl>
-      <w:tblPr>
-        <w:tblW w:type="auto" w:w="0"/>
-        <w:tblLook w:firstColumn="1" w:firstRow="1" w:lastColumn="0" w:lastRow="0" w:noHBand="0" w:noVBand="1" w:val="04A0"/>
-        <w:tblBorders>
-          <w:top w:val="none"/>
-          <w:left w:val="none"/>
-          <w:bottom w:val="none"/>
-          <w:right w:val="none"/>
-          <w:insideH w:val="none"/>
-          <w:insideV w:val="none"/>
-        </w:tblBorders>
-      </w:tblPr>
-      <w:tblGrid>
-        <w:gridCol w:w="4500"/>
-        <w:gridCol w:w="4500"/>
-      </w:tblGrid>
-      <w:tr>
-        <w:tc>
-          <w:tcPr>
-            <w:tcW w:type="dxa" w:w="4500"/>
-          </w:tcPr>
-          <w:p>
-            <w:r>
-              <w:t>....................................................</w:t>
-              <w:br/>
-              <w:t>Academic Supervisor</w:t>
-              <w:br/>
-              <w:t>Department of ECE, HSTU</w:t>
-            </w:r>
-          </w:p>
-        </w:tc>
-        <w:tc>
-          <w:tcPr>
-            <w:tcW w:type="dxa" w:w="4500"/>
-          </w:tcPr>
-          <w:p>
-            <w:r>
-              <w:t>....................................................</w:t>
-              <w:br/>
-              <w:t>Chairman</w:t>
-              <w:br/>
-              <w:t>Examination Committee, HSTU</w:t>
-            </w:r>
-          </w:p>
-        </w:tc>
-      </w:tr>
-    </w:tbl>
-    <w:p>
-      <w:r>
-        <w:br w:type="page"/>
-      </w:r>
-    </w:p>
-    <w:p>
-      <w:pPr>
-        <w:spacing w:before="360" w:after="240"/>
-      </w:pPr>
-      <w:r>
-        <w:rPr>
-          <w:b/>
-          <w:color w:val="0C2C56"/>
-          <w:sz w:val="32"/>
-        </w:rPr>
         <w:t>Industrial Internship Certificate</w:t>
       </w:r>
     </w:p>
@@ -364,26 +222,34 @@
           <w:color w:val="0C2C56"/>
           <w:sz w:val="32"/>
         </w:rPr>
-        <w:t>Candidate's Declaration</w:t>
+        <w:t>Acknowledgements</w:t>
       </w:r>
     </w:p>
     <w:p>
       <w:r>
-        <w:t>I hereby declare that the work presented in this internship report titled “Backend Web Development Using JavaScript Frameworks at Digicon Technologies PLC” is an original account of the industrial training undertaken by me for the award of the degree of Bachelor of Science in Electronics and Communication Engineering at Hajee Mohammad Danesh Science and Technology University (HSTU), Dinajpur, Bangladesh.</w:t>
+        <w:t>First and foremost, all praises and profound gratitude are due to Almighty Allah, the Most Merciful and Most Beneficent, who bestowed upon me the health, intellectual resilience, and perseverance required to complete this industrial internship and compile this comprehensive report.</w:t>
         <w:br/>
         <w:br/>
-        <w:t>Date: October 04, 2026</w:t>
-        <w:br/>
-        <w:t>Place: HSTU, Dinajpur</w:t>
+        <w:t>I express my deepest gratitude, profound respect, and indebtedness to my respected Academic Supervisor in the Department of Electronics and Communication Engineering at Hajee Mohammad Danesh Science and Technology University (HSTU). His critical evaluations, scholarly feedback, and constructive academic stewardship were instrumental in contextualizing my industrial learnings within the foundational principles of computer science and communication engineering.</w:t>
         <w:br/>
         <w:br/>
-        <w:t>....................................................</w:t>
+        <w:t>I extend my heartfelt thanks to the Chairman and all distinguished faculty members of the Department of Electronics and Communication Engineering, HSTU, for providing a vibrant academic ecosystem, rigorous theoretical foundations, and continuous moral support throughout my undergraduate studies.</w:t>
+        <w:br/>
+        <w:br/>
+        <w:t>I am immensely grateful to the executive management and engineering leadership of Digicon Technologies PLC for granting me the invaluable opportunity to undertake this industrial attachment. In particular, I express my sincere appreciation to my Industrial Supervisor (Lead Software Architect) and the senior software engineers within the Software Engineering Division. Their hands-on mentorship, architectural guidance, in-depth code reviews, and constant encouragement allowed me to bridge the critical gap between academic software concepts and high-throughput enterprise production systems.</w:t>
+        <w:br/>
+        <w:br/>
+        <w:t>Finally, words cannot adequately express my lifelong gratitude to my parents and family. Their boundless sacrifices, endless patience, and unyielding faith in my abilities have been my greatest pillar of strength.</w:t>
+        <w:br/>
+        <w:br/>
         <w:br/>
         <w:t>Shahriar Hasan</w:t>
         <w:br/>
         <w:t>Student ID: 2002138</w:t>
         <w:br/>
-        <w:t>Department of ECE, HSTU</w:t>
+        <w:t>HSTU, Dinajpur</w:t>
+        <w:br/>
+        <w:t>October, 2026</w:t>
         <w:br/>
       </w:r>
     </w:p>

</xml_diff>

<commit_message>
Regenerate all figures, LaTeX PDF, Typst PDF, and DOCX deliverables
</commit_message>
<xml_diff>
--- a/internship_report.docx
+++ b/internship_report.docx
@@ -175,7 +175,7 @@
       <w:r>
         <w:drawing>
           <wp:inline xmlns:a="http://schemas.openxmlformats.org/drawingml/2006/main" xmlns:pic="http://schemas.openxmlformats.org/drawingml/2006/picture">
-            <wp:extent cx="5669280" cy="7628972"/>
+            <wp:extent cx="5669280" cy="7614430"/>
             <wp:docPr id="2" name="Picture 2"/>
             <wp:cNvGraphicFramePr>
               <a:graphicFrameLocks noChangeAspect="1"/>
@@ -196,7 +196,7 @@
                   <pic:spPr>
                     <a:xfrm>
                       <a:off x="0" y="0"/>
-                      <a:ext cx="5669280" cy="7628972"/>
+                      <a:ext cx="5669280" cy="7614430"/>
                     </a:xfrm>
                     <a:prstGeom prst="rect"/>
                   </pic:spPr>

</xml_diff>

<commit_message>
Update Course Code to ECE 400 and Course Title to Internship / Project across all documents
</commit_message>
<xml_diff>
--- a/internship_report.docx
+++ b/internship_report.docx
@@ -35,7 +35,7 @@
           <w:b/>
           <w:sz w:val="24"/>
         </w:rPr>
-        <w:t>Course Code: ECE 450    Course Title: Industrial Training / Internship</w:t>
+        <w:t>Course Code: ECE 400    Course Title: Internship / Project</w:t>
         <w:br/>
       </w:r>
     </w:p>
@@ -319,7 +319,7 @@
     </w:p>
     <w:p>
       <w:r>
-        <w:t>In modern communication engineering, theoretical academia is synthesized into practice through enterprise software engineering. The BSc in Electronics and Communication Engineering curriculum at HSTU incorporates a mandatory credit-bearing Industrial Training / Internship (Course Code: ECE 450). The author completed this industrial attachment at Digicon Technologies PLC, a pioneer BPO and IT solutions conglomerate in Dhaka, Bangladesh, employing over 1,500 FTEs across modern contact center and software engineering facilities.</w:t>
+        <w:t>In modern communication engineering, theoretical academia is synthesized into practice through enterprise software engineering. The BSc in Electronics and Communication Engineering curriculum at HSTU incorporates a mandatory credit-bearing Internship / Project (Course Code: ECE 400). The author completed this industrial attachment at Digicon Technologies PLC, a pioneer BPO and IT solutions conglomerate in Dhaka, Bangladesh, employing over 1,500 FTEs across modern contact center and software engineering facilities.</w:t>
       </w:r>
     </w:p>
     <w:p>

</xml_diff>